<commit_message>
paper: sync final version (real evaluation numbers, Zenodo DOI, Seqera/nf-prov positioning, Specvista affiliation, media/figure)
</commit_message>
<xml_diff>
--- a/paper/preprint.docx
+++ b/paper/preprint.docx
@@ -31,7 +31,7 @@
         <w:pStyle w:val="BodyText"/>
       </w:pPr>
       <w:r>
-        <w:t xml:space="preserve">Independent researcher</w:t>
+        <w:t xml:space="preserve">Specvista Technology Limited</w:t>
       </w:r>
     </w:p>
     <w:p>
@@ -88,7 +88,7 @@
         <w:pStyle w:val="FirstParagraph"/>
       </w:pPr>
       <w:r>
-        <w:t xml:space="preserve">Large language model (LLM) assistants can now reach scientific resources through the Model Context Protocol (MCP), and recent work has called for MCP-enabled bioinformatics web services as a machine-actionable layer for LLM-driven discovery. Parts of the execution and provenance problem are already addressed: the Seqera MCP server lets an assistant launch and monitor Nextflow pipelines on a hosted platform, and the nf-prov plugin serialises Nextflow runs as Workflow Run RO-Crates. Three concerns are not covered by that combination. Provenance emitted from inside a workflow engine is tied to that engine; a hosted control plane requires a service account and moves control of execution off the researcher’s machine; and the substitution of model-supplied values into a constructed command, which is the primary attack surface once a non-deterministic agent is in the loop, is not treated as an explicit security boundary. We present FlowProof, an open-source MCP server that executes registered bioinformatics pipelines locally and returns results together with standards-based provenance. A runner-agnostic core places the provenance emitter above the execution backend, so a dependency-free backend used for development and continuous integration and a Nextflow backend used for real workflows produce the same Workflow Run RO-Crate structure, recording pipeline version, container image, tool versions, parameters, and SHA-256 checksums of every input and output. Pipelines are registered by manifest, and every model-supplied value is validated against a character allow-list and assembled into an argument vector that is executed without a shell. Provenance is returned through a dedicated MCP tool, so the assistant that issued a run can surface the record that justifies it. We evaluate reproducibility rather than assert it: across 20 repeated executions on one host, and on a second host of a different operating system and processor architecture, output checksums were byte-identical; an independent verifier consuming only the crate reproduced the recorded runs (including one that used a non-default parameter) and flagged three of four deliberately tampered crates; and 32 of 45 adversarial parameter strings were rejected at the validation boundary, with no value reaching a shell interpreter. FlowProof is distributed as flowproof-mcp under the MIT license at https://github.com/ajibadedapo/flowproof-mcp and archived at [Zenodo DOI to be assigned on archival].</w:t>
+        <w:t xml:space="preserve">Large language model (LLM) assistants can now reach scientific resources through the Model Context Protocol (MCP), and recent work has called for MCP-enabled bioinformatics web services as a machine-actionable layer for LLM-driven discovery. Parts of the execution and provenance problem are already addressed: the Seqera MCP server lets an assistant launch and monitor Nextflow pipelines on a hosted platform, and the nf-prov plugin serialises Nextflow runs as Workflow Run RO-Crates. Three concerns are not covered by that combination. Provenance emitted from inside a workflow engine is tied to that engine; a hosted control plane requires a service account and moves control of execution off the researcher’s machine; and the substitution of model-supplied values into a constructed command, which is the primary attack surface once a non-deterministic agent is in the loop, is not treated as an explicit security boundary. We present FlowProof, an open-source MCP server that executes registered bioinformatics pipelines locally and returns results together with standards-based provenance. A runner-agnostic core places the provenance emitter above the execution backend, so a dependency-free backend used for development and continuous integration and a Nextflow backend used for real workflows produce the same Workflow Run RO-Crate structure, recording pipeline version, container image, tool versions, parameters, and SHA-256 checksums of every input and output. Pipelines are registered by manifest, and every model-supplied value is validated against a character allow-list and assembled into an argument vector that is executed without a shell. Provenance is returned through a dedicated MCP tool, so the assistant that issued a run can surface the record that justifies it. We evaluate reproducibility rather than assert it: across 20 repeated executions on one host, and on a second host of a different operating system and processor architecture, output checksums were byte-identical; an independent verifier consuming only the crate reproduced the recorded runs (including one that used a non-default parameter) and flagged three of four deliberately tampered crates; and 32 of 45 adversarial parameter strings were rejected at the validation boundary, with no value reaching a shell interpreter. FlowProof is distributed as flowproof-mcp under the MIT license at https://github.com/ajibadedapo/flowproof-mcp and archived at Zenodo (doi:10.5281/zenodo.21932977).</w:t>
       </w:r>
     </w:p>
     <w:p>
@@ -1875,7 +1875,7 @@
         <w:pStyle w:val="FirstParagraph"/>
       </w:pPr>
       <w:r>
-        <w:t xml:space="preserve">FlowProof is open source under the MIT license. Source code, documentation, pipeline manifests, the evaluation scripts, and the complete example provenance crate are at https://github.com/ajibadedapo/flowproof-mcp, with the version described here to be archived at Zenodo (DOI assigned on archival). It is installable from the Python Package Index (pip install flowproof-mcp; uvx flowproof-mcp) and requires Python 3.10 or later; the Nextflow backend additionally requires Nextflow (tested with 26.04.6) and, for container-based stages, a container runtime. The pipeline registry, execution backends, parameter validation, and provenance emitter are covered by an automated test suite of 36 tests that runs in the project’s continuous integration.</w:t>
+        <w:t xml:space="preserve">FlowProof is open source under the MIT license. Source code, documentation, pipeline manifests, the evaluation scripts, and the complete example provenance crate are at https://github.com/ajibadedapo/flowproof-mcp, with the version described here archived at Zenodo (doi:10.5281/zenodo.21932977). It is installable from the Python Package Index (pip install flowproof-mcp; uvx flowproof-mcp) and requires Python 3.10 or later; the Nextflow backend additionally requires Nextflow (tested with 26.04.6) and, for container-based stages, a container runtime. The pipeline registry, execution backends, parameter validation, and provenance emitter are covered by an automated test suite of 36 tests that runs in the project’s continuous integration.</w:t>
       </w:r>
     </w:p>
     <w:bookmarkEnd w:id="20"/>
@@ -1961,7 +1961,7 @@
         <w:t xml:space="preserve"> </w:t>
       </w:r>
       <w:r>
-        <w:t xml:space="preserve">All data supporting the results are the bundled sample inputs, emitted crates, and evaluation logs in the eval/ directory of the repository, to be archived at Zenodo on submission. No human or animal subjects were involved.</w:t>
+        <w:t xml:space="preserve">All data supporting the results are the bundled sample inputs, emitted crates, and evaluation logs in the eval/ directory of the repository, archived at Zenodo (doi:10.5281/zenodo.21932977). No human or animal subjects were involved.</w:t>
       </w:r>
     </w:p>
     <w:bookmarkEnd w:id="21"/>

</xml_diff>